<commit_message>
docs updated: LCP04 and 05
</commit_message>
<xml_diff>
--- a/6. Documentation With Templates/LCP04_FSRS/LCP04-AIRBAG-ECU-001_FSRS_v100.docx
+++ b/6. Documentation With Templates/LCP04_FSRS/LCP04-AIRBAG-ECU-001_FSRS_v100.docx
@@ -17920,7 +17920,10 @@
           </w:tcPr>
           <w:p>
             <w:r>
-              <w:t>LCP04-AIRBAG-ECU-001_FSRS_v100.docx</w:t>
+              <w:t>Safety_Req_Specification_V1</w:t>
+            </w:r>
+            <w:r>
+              <w:t>.docx</w:t>
             </w:r>
           </w:p>
         </w:tc>
@@ -17968,7 +17971,7 @@
           </w:tcPr>
           <w:p>
             <w:r>
-              <w:t>Version 1.00 — Initial release of the Functional Safety Requirements Specification (FSRS / LCP04) for the Airbag ECU project. Derived from HARA (LCP03). Covers requirements FSR-01 through FSR-22, safety constraints SC-01–SC-09, timing requirements, safe states SS-01–SS-05, interface definitions, and requirement traceability matrix. Based on confirmed dual-channel Arduino Due laboratory implementation. Classified ASIL D / SIL 3.</w:t>
+              <w:t>Version 1.00 — Initial release of the Functional Safety Requirements Specification (FSRS / LCP04) for the Airbag ECU project.</w:t>
             </w:r>
           </w:p>
         </w:tc>

</xml_diff>